<commit_message>
SEQUOIADBMAINSTREAM-3822: Update document Story_基于代价估算模型的查询优化.docx
git-svn-id: http://192.168.20.11/sequoiadb/trunk@40852 6121f079-4a18-41d3-8c30-8870a322f2c2
</commit_message>
<xml_diff>
--- a/internal_doc/03.开发设计/性能/Story_基于代价估算模型的查询优化.docx
+++ b/internal_doc/03.开发设计/性能/Story_基于代价估算模型的查询优化.docx
@@ -693,9 +693,6 @@
         </w:numPr>
         <w:ind w:firstLineChars="0"/>
         <w:jc w:val="left"/>
-        <w:rPr>
-          <w:rFonts w:hint="eastAsia"/>
-        </w:rPr>
       </w:pPr>
       <w:r>
         <w:rPr>
@@ -785,9 +782,6 @@
         </w:numPr>
         <w:ind w:firstLineChars="0"/>
         <w:jc w:val="left"/>
-        <w:rPr>
-          <w:rFonts w:hint="eastAsia"/>
-        </w:rPr>
       </w:pPr>
       <w:r>
         <w:rPr>
@@ -14553,6 +14547,100 @@
           </w:p>
         </w:tc>
       </w:tr>
+      <w:tr>
+        <w:tc>
+          <w:tcPr>
+            <w:tcW w:w="1594" w:type="dxa"/>
+            <w:vMerge/>
+          </w:tcPr>
+          <w:p>
+            <w:pPr>
+              <w:ind w:left="0"/>
+              <w:rPr>
+                <w:sz w:val="15"/>
+                <w:szCs w:val="15"/>
+              </w:rPr>
+            </w:pPr>
+          </w:p>
+        </w:tc>
+        <w:tc>
+          <w:tcPr>
+            <w:tcW w:w="1861" w:type="dxa"/>
+          </w:tcPr>
+          <w:p>
+            <w:pPr>
+              <w:ind w:left="0"/>
+              <w:rPr>
+                <w:rFonts w:hint="eastAsia"/>
+                <w:sz w:val="15"/>
+                <w:szCs w:val="15"/>
+              </w:rPr>
+            </w:pPr>
+            <w:r>
+              <w:rPr>
+                <w:rFonts w:hint="eastAsia"/>
+                <w:sz w:val="15"/>
+                <w:szCs w:val="15"/>
+              </w:rPr>
+              <w:t>optFieldExtractCost</w:t>
+            </w:r>
+          </w:p>
+        </w:tc>
+        <w:tc>
+          <w:tcPr>
+            <w:tcW w:w="1557" w:type="dxa"/>
+          </w:tcPr>
+          <w:p>
+            <w:pPr>
+              <w:ind w:left="0"/>
+              <w:rPr>
+                <w:rFonts w:hint="eastAsia"/>
+                <w:sz w:val="15"/>
+                <w:szCs w:val="15"/>
+              </w:rPr>
+            </w:pPr>
+            <w:r>
+              <w:rPr>
+                <w:rFonts w:hint="eastAsia"/>
+                <w:sz w:val="15"/>
+                <w:szCs w:val="15"/>
+              </w:rPr>
+              <w:t>2</w:t>
+            </w:r>
+          </w:p>
+        </w:tc>
+        <w:tc>
+          <w:tcPr>
+            <w:tcW w:w="1596" w:type="dxa"/>
+          </w:tcPr>
+          <w:p>
+            <w:pPr>
+              <w:ind w:left="0"/>
+              <w:rPr>
+                <w:rFonts w:hint="eastAsia"/>
+                <w:sz w:val="15"/>
+                <w:szCs w:val="15"/>
+              </w:rPr>
+            </w:pPr>
+            <w:r>
+              <w:rPr>
+                <w:rFonts w:hint="eastAsia"/>
+                <w:sz w:val="15"/>
+                <w:szCs w:val="15"/>
+              </w:rPr>
+              <w:t xml:space="preserve">CPU </w:t>
+            </w:r>
+            <w:r>
+              <w:rPr>
+                <w:rFonts w:hint="eastAsia"/>
+                <w:sz w:val="15"/>
+                <w:szCs w:val="15"/>
+              </w:rPr>
+              <w:t>从数据中提取字段的代价</w:t>
+            </w:r>
+          </w:p>
+        </w:tc>
+      </w:tr>
     </w:tbl>
     <w:p>
       <w:r>
@@ -14809,7 +14897,7 @@
       </w:tblPr>
       <w:tblGrid>
         <w:gridCol w:w="977"/>
-        <w:gridCol w:w="1949"/>
+        <w:gridCol w:w="3280"/>
       </w:tblGrid>
       <w:tr>
         <w:tc>
@@ -14890,6 +14978,30 @@
                 <w:sz w:val="15"/>
                 <w:szCs w:val="15"/>
               </w:rPr>
+              <w:t>optFieldExtractCost</w:t>
+            </w:r>
+            <w:r>
+              <w:rPr>
+                <w:rFonts w:hint="eastAsia"/>
+                <w:sz w:val="15"/>
+                <w:szCs w:val="15"/>
+              </w:rPr>
+              <w:t xml:space="preserve"> </w:t>
+            </w:r>
+            <w:r>
+              <w:rPr>
+                <w:rFonts w:hint="eastAsia"/>
+                <w:sz w:val="15"/>
+                <w:szCs w:val="15"/>
+              </w:rPr>
+              <w:t xml:space="preserve">+ </w:t>
+            </w:r>
+            <w:r>
+              <w:rPr>
+                <w:rFonts w:hint="eastAsia"/>
+                <w:sz w:val="15"/>
+                <w:szCs w:val="15"/>
+              </w:rPr>
               <w:t>optrBaseCost</w:t>
             </w:r>
           </w:p>
@@ -14936,6 +15048,30 @@
                 <w:sz w:val="15"/>
                 <w:szCs w:val="15"/>
               </w:rPr>
+              <w:t>optFieldExtractCost</w:t>
+            </w:r>
+            <w:r>
+              <w:rPr>
+                <w:rFonts w:hint="eastAsia"/>
+                <w:sz w:val="15"/>
+                <w:szCs w:val="15"/>
+              </w:rPr>
+              <w:t xml:space="preserve"> </w:t>
+            </w:r>
+            <w:r>
+              <w:rPr>
+                <w:rFonts w:hint="eastAsia"/>
+                <w:sz w:val="15"/>
+                <w:szCs w:val="15"/>
+              </w:rPr>
+              <w:t xml:space="preserve">+ </w:t>
+            </w:r>
+            <w:r>
+              <w:rPr>
+                <w:rFonts w:hint="eastAsia"/>
+                <w:sz w:val="15"/>
+                <w:szCs w:val="15"/>
+              </w:rPr>
               <w:t>optrBaseCost</w:t>
             </w:r>
           </w:p>
@@ -14982,6 +15118,30 @@
                 <w:sz w:val="15"/>
                 <w:szCs w:val="15"/>
               </w:rPr>
+              <w:t>optFieldExtractCost</w:t>
+            </w:r>
+            <w:r>
+              <w:rPr>
+                <w:rFonts w:hint="eastAsia"/>
+                <w:sz w:val="15"/>
+                <w:szCs w:val="15"/>
+              </w:rPr>
+              <w:t xml:space="preserve"> </w:t>
+            </w:r>
+            <w:r>
+              <w:rPr>
+                <w:rFonts w:hint="eastAsia"/>
+                <w:sz w:val="15"/>
+                <w:szCs w:val="15"/>
+              </w:rPr>
+              <w:t xml:space="preserve">+ </w:t>
+            </w:r>
+            <w:r>
+              <w:rPr>
+                <w:rFonts w:hint="eastAsia"/>
+                <w:sz w:val="15"/>
+                <w:szCs w:val="15"/>
+              </w:rPr>
               <w:t>optrBaseCost</w:t>
             </w:r>
           </w:p>
@@ -15028,6 +15188,30 @@
                 <w:sz w:val="15"/>
                 <w:szCs w:val="15"/>
               </w:rPr>
+              <w:t>optFieldExtractCost</w:t>
+            </w:r>
+            <w:r>
+              <w:rPr>
+                <w:rFonts w:hint="eastAsia"/>
+                <w:sz w:val="15"/>
+                <w:szCs w:val="15"/>
+              </w:rPr>
+              <w:t xml:space="preserve"> </w:t>
+            </w:r>
+            <w:r>
+              <w:rPr>
+                <w:rFonts w:hint="eastAsia"/>
+                <w:sz w:val="15"/>
+                <w:szCs w:val="15"/>
+              </w:rPr>
+              <w:t xml:space="preserve">+ </w:t>
+            </w:r>
+            <w:r>
+              <w:rPr>
+                <w:rFonts w:hint="eastAsia"/>
+                <w:sz w:val="15"/>
+                <w:szCs w:val="15"/>
+              </w:rPr>
               <w:t>optrBaseCost</w:t>
             </w:r>
           </w:p>
@@ -15074,6 +15258,30 @@
                 <w:sz w:val="15"/>
                 <w:szCs w:val="15"/>
               </w:rPr>
+              <w:t>optFieldExtractCost</w:t>
+            </w:r>
+            <w:r>
+              <w:rPr>
+                <w:rFonts w:hint="eastAsia"/>
+                <w:sz w:val="15"/>
+                <w:szCs w:val="15"/>
+              </w:rPr>
+              <w:t xml:space="preserve"> </w:t>
+            </w:r>
+            <w:r>
+              <w:rPr>
+                <w:rFonts w:hint="eastAsia"/>
+                <w:sz w:val="15"/>
+                <w:szCs w:val="15"/>
+              </w:rPr>
+              <w:t xml:space="preserve">+ </w:t>
+            </w:r>
+            <w:r>
+              <w:rPr>
+                <w:rFonts w:hint="eastAsia"/>
+                <w:sz w:val="15"/>
+                <w:szCs w:val="15"/>
+              </w:rPr>
               <w:t>optrBaseCost</w:t>
             </w:r>
           </w:p>
@@ -15120,6 +15328,30 @@
                 <w:sz w:val="15"/>
                 <w:szCs w:val="15"/>
               </w:rPr>
+              <w:t>optFieldExtractCost</w:t>
+            </w:r>
+            <w:r>
+              <w:rPr>
+                <w:rFonts w:hint="eastAsia"/>
+                <w:sz w:val="15"/>
+                <w:szCs w:val="15"/>
+              </w:rPr>
+              <w:t xml:space="preserve"> </w:t>
+            </w:r>
+            <w:r>
+              <w:rPr>
+                <w:rFonts w:hint="eastAsia"/>
+                <w:sz w:val="15"/>
+                <w:szCs w:val="15"/>
+              </w:rPr>
+              <w:t xml:space="preserve">+ </w:t>
+            </w:r>
+            <w:r>
+              <w:rPr>
+                <w:rFonts w:hint="eastAsia"/>
+                <w:sz w:val="15"/>
+                <w:szCs w:val="15"/>
+              </w:rPr>
               <w:t>optrBaseCost</w:t>
             </w:r>
           </w:p>
@@ -15144,6 +15376,7 @@
                 <w:sz w:val="15"/>
                 <w:szCs w:val="15"/>
               </w:rPr>
+              <w:lastRenderedPageBreak/>
               <w:t>$mod</w:t>
             </w:r>
           </w:p>
@@ -15160,6 +15393,30 @@
                 <w:szCs w:val="15"/>
               </w:rPr>
             </w:pPr>
+            <w:r>
+              <w:rPr>
+                <w:rFonts w:hint="eastAsia"/>
+                <w:sz w:val="15"/>
+                <w:szCs w:val="15"/>
+              </w:rPr>
+              <w:t>optFieldExtractCost</w:t>
+            </w:r>
+            <w:r>
+              <w:rPr>
+                <w:rFonts w:hint="eastAsia"/>
+                <w:sz w:val="15"/>
+                <w:szCs w:val="15"/>
+              </w:rPr>
+              <w:t xml:space="preserve"> </w:t>
+            </w:r>
+            <w:r>
+              <w:rPr>
+                <w:rFonts w:hint="eastAsia"/>
+                <w:sz w:val="15"/>
+                <w:szCs w:val="15"/>
+              </w:rPr>
+              <w:t xml:space="preserve">+ </w:t>
+            </w:r>
             <w:r>
               <w:rPr>
                 <w:rFonts w:hint="eastAsia"/>
@@ -15212,6 +15469,30 @@
                 <w:sz w:val="15"/>
                 <w:szCs w:val="15"/>
               </w:rPr>
+              <w:t>optFieldExtractCost</w:t>
+            </w:r>
+            <w:r>
+              <w:rPr>
+                <w:rFonts w:hint="eastAsia"/>
+                <w:sz w:val="15"/>
+                <w:szCs w:val="15"/>
+              </w:rPr>
+              <w:t xml:space="preserve"> </w:t>
+            </w:r>
+            <w:r>
+              <w:rPr>
+                <w:rFonts w:hint="eastAsia"/>
+                <w:sz w:val="15"/>
+                <w:szCs w:val="15"/>
+              </w:rPr>
+              <w:t xml:space="preserve">+ </w:t>
+            </w:r>
+            <w:r>
+              <w:rPr>
+                <w:rFonts w:hint="eastAsia"/>
+                <w:sz w:val="15"/>
+                <w:szCs w:val="15"/>
+              </w:rPr>
               <w:t>optrBaseCost</w:t>
             </w:r>
             <w:r>
@@ -15252,7 +15533,6 @@
                 <w:sz w:val="15"/>
                 <w:szCs w:val="15"/>
               </w:rPr>
-              <w:lastRenderedPageBreak/>
               <w:t>$nin</w:t>
             </w:r>
           </w:p>
@@ -15269,6 +15549,30 @@
                 <w:szCs w:val="15"/>
               </w:rPr>
             </w:pPr>
+            <w:r>
+              <w:rPr>
+                <w:rFonts w:hint="eastAsia"/>
+                <w:sz w:val="15"/>
+                <w:szCs w:val="15"/>
+              </w:rPr>
+              <w:t>optFieldExtractCost</w:t>
+            </w:r>
+            <w:r>
+              <w:rPr>
+                <w:rFonts w:hint="eastAsia"/>
+                <w:sz w:val="15"/>
+                <w:szCs w:val="15"/>
+              </w:rPr>
+              <w:t xml:space="preserve"> </w:t>
+            </w:r>
+            <w:r>
+              <w:rPr>
+                <w:rFonts w:hint="eastAsia"/>
+                <w:sz w:val="15"/>
+                <w:szCs w:val="15"/>
+              </w:rPr>
+              <w:t xml:space="preserve">+ </w:t>
+            </w:r>
             <w:r>
               <w:rPr>
                 <w:rFonts w:hint="eastAsia"/>
@@ -15337,6 +15641,30 @@
                 <w:sz w:val="15"/>
                 <w:szCs w:val="15"/>
               </w:rPr>
+              <w:t>optFieldExtractCost</w:t>
+            </w:r>
+            <w:r>
+              <w:rPr>
+                <w:rFonts w:hint="eastAsia"/>
+                <w:sz w:val="15"/>
+                <w:szCs w:val="15"/>
+              </w:rPr>
+              <w:t xml:space="preserve"> </w:t>
+            </w:r>
+            <w:r>
+              <w:rPr>
+                <w:rFonts w:hint="eastAsia"/>
+                <w:sz w:val="15"/>
+                <w:szCs w:val="15"/>
+              </w:rPr>
+              <w:t xml:space="preserve">+ </w:t>
+            </w:r>
+            <w:r>
+              <w:rPr>
+                <w:rFonts w:hint="eastAsia"/>
+                <w:sz w:val="15"/>
+                <w:szCs w:val="15"/>
+              </w:rPr>
               <w:t>optrBaseCost</w:t>
             </w:r>
             <w:r>
@@ -15399,6 +15727,30 @@
                 <w:sz w:val="15"/>
                 <w:szCs w:val="15"/>
               </w:rPr>
+              <w:t>optFieldExtractCost</w:t>
+            </w:r>
+            <w:r>
+              <w:rPr>
+                <w:rFonts w:hint="eastAsia"/>
+                <w:sz w:val="15"/>
+                <w:szCs w:val="15"/>
+              </w:rPr>
+              <w:t xml:space="preserve"> </w:t>
+            </w:r>
+            <w:r>
+              <w:rPr>
+                <w:rFonts w:hint="eastAsia"/>
+                <w:sz w:val="15"/>
+                <w:szCs w:val="15"/>
+              </w:rPr>
+              <w:t xml:space="preserve">+ </w:t>
+            </w:r>
+            <w:r>
+              <w:rPr>
+                <w:rFonts w:hint="eastAsia"/>
+                <w:sz w:val="15"/>
+                <w:szCs w:val="15"/>
+              </w:rPr>
               <w:t>optrBaseCost</w:t>
             </w:r>
           </w:p>
@@ -15445,6 +15797,30 @@
                 <w:sz w:val="15"/>
                 <w:szCs w:val="15"/>
               </w:rPr>
+              <w:t>optFieldExtractCost</w:t>
+            </w:r>
+            <w:r>
+              <w:rPr>
+                <w:rFonts w:hint="eastAsia"/>
+                <w:sz w:val="15"/>
+                <w:szCs w:val="15"/>
+              </w:rPr>
+              <w:t xml:space="preserve"> </w:t>
+            </w:r>
+            <w:r>
+              <w:rPr>
+                <w:rFonts w:hint="eastAsia"/>
+                <w:sz w:val="15"/>
+                <w:szCs w:val="15"/>
+              </w:rPr>
+              <w:t xml:space="preserve">+ </w:t>
+            </w:r>
+            <w:r>
+              <w:rPr>
+                <w:rFonts w:hint="eastAsia"/>
+                <w:sz w:val="15"/>
+                <w:szCs w:val="15"/>
+              </w:rPr>
               <w:t>optrBaseCost</w:t>
             </w:r>
             <w:r>
@@ -15523,6 +15899,30 @@
                 <w:sz w:val="15"/>
                 <w:szCs w:val="15"/>
               </w:rPr>
+              <w:t>optFieldExtractCost</w:t>
+            </w:r>
+            <w:r>
+              <w:rPr>
+                <w:rFonts w:hint="eastAsia"/>
+                <w:sz w:val="15"/>
+                <w:szCs w:val="15"/>
+              </w:rPr>
+              <w:t xml:space="preserve"> </w:t>
+            </w:r>
+            <w:r>
+              <w:rPr>
+                <w:rFonts w:hint="eastAsia"/>
+                <w:sz w:val="15"/>
+                <w:szCs w:val="15"/>
+              </w:rPr>
+              <w:t xml:space="preserve">+ </w:t>
+            </w:r>
+            <w:r>
+              <w:rPr>
+                <w:rFonts w:hint="eastAsia"/>
+                <w:sz w:val="15"/>
+                <w:szCs w:val="15"/>
+              </w:rPr>
               <w:t>optrBaseCost</w:t>
             </w:r>
             <w:r>
@@ -15571,6 +15971,30 @@
                 <w:szCs w:val="15"/>
               </w:rPr>
             </w:pPr>
+            <w:r>
+              <w:rPr>
+                <w:rFonts w:hint="eastAsia"/>
+                <w:sz w:val="15"/>
+                <w:szCs w:val="15"/>
+              </w:rPr>
+              <w:t>optFieldExtractCost</w:t>
+            </w:r>
+            <w:r>
+              <w:rPr>
+                <w:rFonts w:hint="eastAsia"/>
+                <w:sz w:val="15"/>
+                <w:szCs w:val="15"/>
+              </w:rPr>
+              <w:t xml:space="preserve"> </w:t>
+            </w:r>
+            <w:r>
+              <w:rPr>
+                <w:rFonts w:hint="eastAsia"/>
+                <w:sz w:val="15"/>
+                <w:szCs w:val="15"/>
+              </w:rPr>
+              <w:t xml:space="preserve">+ </w:t>
+            </w:r>
             <w:r>
               <w:rPr>
                 <w:rFonts w:hint="eastAsia"/>
@@ -15973,6 +16397,9 @@
           <w:numId w:val="17"/>
         </w:numPr>
         <w:ind w:firstLineChars="0"/>
+        <w:rPr>
+          <w:rFonts w:hint="eastAsia"/>
+        </w:rPr>
       </w:pPr>
       <w:r>
         <w:rPr>
@@ -15991,6 +16418,40 @@
           <w:rFonts w:hint="eastAsia"/>
         </w:rPr>
         <w:t>节点的代价相加</w:t>
+      </w:r>
+    </w:p>
+    <w:p>
+      <w:pPr>
+        <w:pStyle w:val="ListParagraph"/>
+        <w:numPr>
+          <w:ilvl w:val="0"/>
+          <w:numId w:val="17"/>
+        </w:numPr>
+        <w:ind w:firstLineChars="0"/>
+      </w:pPr>
+      <w:r>
+        <w:rPr>
+          <w:rFonts w:hint="eastAsia"/>
+        </w:rPr>
+        <w:t>去除加入索引键的</w:t>
+      </w:r>
+      <w:r>
+        <w:rPr>
+          <w:rFonts w:hint="eastAsia"/>
+        </w:rPr>
+        <w:t xml:space="preserve"> mthTree </w:t>
+      </w:r>
+      <w:r>
+        <w:rPr>
+          <w:rFonts w:hint="eastAsia"/>
+        </w:rPr>
+        <w:t>节点的</w:t>
+      </w:r>
+      <w:r>
+        <w:rPr>
+          <w:rFonts w:hint="eastAsia"/>
+        </w:rPr>
+        <w:t>代价</w:t>
       </w:r>
     </w:p>
     <w:p/>
@@ -16481,7 +16942,6 @@
             <w:rPr>
               <w:rFonts w:ascii="Cambria Math" w:hAnsi="Cambria Math"/>
             </w:rPr>
-            <w:lastRenderedPageBreak/>
             <m:t>tblScanCost=ioCost+cpuCost</m:t>
           </m:r>
         </m:oMath>
@@ -17935,6 +18395,7 @@
         <w:rPr>
           <w:rFonts w:hint="eastAsia"/>
         </w:rPr>
+        <w:lastRenderedPageBreak/>
         <w:t>读取过程中，假设</w:t>
       </w:r>
       <w:r>
@@ -18008,7 +18469,6 @@
         <w:rPr>
           <w:rFonts w:hint="eastAsia"/>
         </w:rPr>
-        <w:lastRenderedPageBreak/>
         <w:t>IO</w:t>
       </w:r>
       <w:r>
@@ -24930,7 +25390,6 @@
   <w:style w:type="character" w:default="1" w:styleId="DefaultParagraphFont">
     <w:name w:val="Default Paragraph Font"/>
     <w:uiPriority w:val="1"/>
-    <w:semiHidden/>
     <w:unhideWhenUsed/>
   </w:style>
   <w:style w:type="table" w:default="1" w:styleId="TableNormal">

</xml_diff>